<commit_message>
feat: revisión de literatura con fuentes reales (verificadas) + sección Literatura web
- Capítulo 3 de la tesis redactado con referencias verificadas en fuentes
  primarias: Chen-Roll-Ross (1986), Amihud (2002), Chen-Rogoff (2003),
  Pesaran-Shin-Smith (2001), BCCh WP640, y la canónica econométrica con DOIs.
- Sección 'Literatura' en la plataforma web con 4 pilares y referencias enlazadas.
- Word actualizado (copia web); docs/ pendiente por archivo bloqueado en Word.

Co-Authored-By: Claude Opus 4.8 <noreply@anthropic.com>
</commit_message>
<xml_diff>
--- a/web/assets/docs/Tesis_USS.docx
+++ b/web/assets/docs/Tesis_USS.docx
@@ -695,23 +695,21 @@
         <w:t>Arbitrage Pricing Theory (APT)</w:t>
       </w:r>
       <w:r>
-        <w:t xml:space="preserve"> y los modelos de factores macroeconómicos</w:t>
-      </w:r>
-    </w:p>
-    <w:p>
-      <w:r>
-        <w:t>sobre retornos accionarios *[POR VERIFICAR: Chen, Roll &amp; Ross, 1986; Fama, p. ej.</w:t>
-      </w:r>
-    </w:p>
-    <w:p>
-      <w:r>
-        <w:t>Fama &amp; French]* dan sustento a una especificación multifactorial lineal para los</w:t>
-      </w:r>
-    </w:p>
-    <w:p>
-      <w:r>
-        <w:t xml:space="preserve">retornos. La distinción entre </w:t>
-      </w:r>
+        <w:t xml:space="preserve"> (Ross, 1976) y los modelos de factores</w:t>
+      </w:r>
+    </w:p>
+    <w:p>
+      <w:r>
+        <w:t>macroeconómicos sobre retornos accionarios (Chen, Roll y Ross, 1986) dan sustento a</w:t>
+      </w:r>
+    </w:p>
+    <w:p>
+      <w:r>
+        <w:t>una especificación multifactorial lineal para los retornos. La distinción entre</w:t>
+      </w:r>
+    </w:p>
+    <w:p>
+      <w:r/>
       <w:r>
         <w:rPr>
           <w:b/>
@@ -728,17 +726,12 @@
         <w:t>cambios</w:t>
       </w:r>
       <w:r>
-        <w:t xml:space="preserve"> (retornos</w:t>
-      </w:r>
-    </w:p>
-    <w:p>
-      <w:r>
-        <w:t>I(0)) motiva separar el análisis de equilibrio de largo plazo (cointegración) del</w:t>
-      </w:r>
-    </w:p>
-    <w:p>
-      <w:r>
-        <w:t>de impacto de corto plazo.</w:t>
+        <w:t xml:space="preserve"> (retornos I(0)) motiva separar el análisis</w:t>
+      </w:r>
+    </w:p>
+    <w:p>
+      <w:r>
+        <w:t>de equilibrio de largo plazo (cointegración) del de impacto de corto plazo.</w:t>
       </w:r>
     </w:p>
     <w:p>
@@ -750,78 +743,431 @@
       </w:r>
     </w:p>
     <w:p>
-      <w:r>
-        <w:t>[SECCIÓN A COMPLETAR CON FUENTES REALES — no se incluyen citas inventadas.]</w:t>
-      </w:r>
-    </w:p>
-    <w:p>
-      <w:r>
-        <w:t>Líneas a cubrir y verificar en Scopus/WoS/Scholar:</w:t>
+      <w:pPr>
+        <w:pStyle w:val="IntenseQuote"/>
+      </w:pPr>
+      <w:r>
+        <w:t>Las referencias de esta sección fueron verificadas en fuentes primarias (editor /</w:t>
+      </w:r>
+    </w:p>
+    <w:p>
+      <w:pPr>
+        <w:pStyle w:val="IntenseQuote"/>
+      </w:pPr>
+      <w:r>
+        <w:t>repositorios académicos). Se recomienda una revisión final del formato APA y de la</w:t>
+      </w:r>
+    </w:p>
+    <w:p>
+      <w:pPr>
+        <w:pStyle w:val="IntenseQuote"/>
+      </w:pPr>
+      <w:r>
+        <w:t>paginación exacta antes de la entrega. Los enlaces se listan en el Capítulo 9.</w:t>
+      </w:r>
+    </w:p>
+    <w:p>
+      <w:pPr>
+        <w:pStyle w:val="Heading3"/>
+      </w:pPr>
+      <w:r>
+        <w:t>3.1 Factores macroeconómicos y retornos accionarios (APT)</w:t>
+      </w:r>
+    </w:p>
+    <w:p>
+      <w:r>
+        <w:t>La base teórica que vincula variables macro con retornos accionarios es el</w:t>
+      </w:r>
+    </w:p>
+    <w:p>
+      <w:r>
+        <w:t>Arbitrage Pricing Theory (Ross, 1976) y su contrastación empírica seminal en</w:t>
+      </w:r>
+    </w:p>
+    <w:p>
+      <w:r/>
+      <w:r>
+        <w:rPr>
+          <w:b/>
+        </w:rPr>
+        <w:t>Chen, Roll y Ross (1986)</w:t>
+      </w:r>
+      <w:r>
+        <w:t>, quienes muestran que innovaciones en la producción</w:t>
+      </w:r>
+    </w:p>
+    <w:p>
+      <w:r>
+        <w:t>industrial, la inflación (esperada y no esperada), la prima por riesgo (spread de</w:t>
+      </w:r>
+    </w:p>
+    <w:p>
+      <w:r>
+        <w:t>bonos) y la pendiente de la estructura temporal son **factores de riesgo</w:t>
+      </w:r>
+    </w:p>
+    <w:p>
+      <w:r>
+        <w:t>sistemáticamente valorados** en el mercado accionario estadounidense. Esta</w:t>
+      </w:r>
+    </w:p>
+    <w:p>
+      <w:r>
+        <w:t>literatura justifica la especificación multifactorial de los retornos empleada en</w:t>
+      </w:r>
+    </w:p>
+    <w:p>
+      <w:r>
+        <w:t>el Capítulo 6 (canales de demanda, descuento, riesgo y moneda) y la inclusión de</w:t>
+      </w:r>
+    </w:p>
+    <w:p>
+      <w:r>
+        <w:t>tasas (UST, TPM), dólar (DXY) y riesgo (VIX) como regresores.</w:t>
+      </w:r>
+    </w:p>
+    <w:p>
+      <w:pPr>
+        <w:pStyle w:val="Heading3"/>
+      </w:pPr>
+      <w:r>
+        <w:t>3.2 Commodities, "monedas-commodity" y economías cupríferas</w:t>
+      </w:r>
+    </w:p>
+    <w:p>
+      <w:r/>
+      <w:r>
+        <w:rPr>
+          <w:b/>
+        </w:rPr>
+        <w:t>Chen y Rogoff (2003)</w:t>
+      </w:r>
+      <w:r>
+        <w:t xml:space="preserve"> acuñan el concepto de commodity currency: para</w:t>
+      </w:r>
+    </w:p>
+    <w:p>
+      <w:r>
+        <w:t>economías exportadoras de materias primas, el precio mundial de su canasta</w:t>
+      </w:r>
+    </w:p>
+    <w:p>
+      <w:r>
+        <w:t>exportadora es un determinante robusto del tipo de cambio real. El caso chileno es</w:t>
+      </w:r>
+    </w:p>
+    <w:p>
+      <w:r>
+        <w:t>arquetípico —el cobre representa cerca de la mitad de las exportaciones— y existe</w:t>
+      </w:r>
+    </w:p>
+    <w:p>
+      <w:r>
+        <w:t xml:space="preserve">evidencia específica: el </w:t>
+      </w:r>
+      <w:r>
+        <w:rPr>
+          <w:b/>
+        </w:rPr>
+        <w:t>Working Paper N°640 del Banco Central de Chile</w:t>
+      </w:r>
+      <w:r/>
+    </w:p>
+    <w:p>
+      <w:r>
+        <w:t>(Copper, the Real Exchange Rate and Macroeconomic Fluctuations in Chile) analiza</w:t>
+      </w:r>
+    </w:p>
+    <w:p>
+      <w:r>
+        <w:t>el rol del cobre y el tipo de cambio real como amortiguadores de shocks, y trabajos</w:t>
+      </w:r>
+    </w:p>
+    <w:p>
+      <w:r>
+        <w:t>en Resources Policy documentan que **el tipo de cambio chileno tiene poder</w:t>
+      </w:r>
+    </w:p>
+    <w:p>
+      <w:r>
+        <w:t>predictivo sobre los precios de metales base** (relación cobre↔CLP de doble vía).</w:t>
+      </w:r>
+    </w:p>
+    <w:p>
+      <w:r>
+        <w:t>Esta literatura fundamenta el canal moneda (USD/CLP, DXY) y motiva tratar el cobre</w:t>
+      </w:r>
+    </w:p>
+    <w:p>
+      <w:r>
+        <w:t>como variable exógena/forzante frente a las acciones locales (coherente con la</w:t>
+      </w:r>
+    </w:p>
+    <w:p>
+      <w:r>
+        <w:t>causalidad unidireccional hallada por Toda-Yamamoto en §6.12).</w:t>
+      </w:r>
+    </w:p>
+    <w:p>
+      <w:pPr>
+        <w:pStyle w:val="Heading3"/>
+      </w:pPr>
+      <w:r>
+        <w:t>3.3 Iliquidez y descubrimiento de precios</w:t>
+      </w:r>
+    </w:p>
+    <w:p>
+      <w:r>
+        <w:t xml:space="preserve">El hallazgo central de esta tesis dialoga directamente con </w:t>
+      </w:r>
+      <w:r>
+        <w:rPr>
+          <w:b/>
+        </w:rPr>
+        <w:t>Amihud (2002)</w:t>
+      </w:r>
+      <w:r>
+        <w:t>, quien</w:t>
+      </w:r>
+    </w:p>
+    <w:p>
+      <w:r>
+        <w:t>propone el ratio de iliquidez \(\text{ILLIQ}=|r|/\text{volumen}\$\) y muestra que la</w:t>
+      </w:r>
+    </w:p>
+    <w:p>
+      <w:r>
+        <w:t>iliquidez (i) está positivamente asociada a los retornos esperados (prima de</w:t>
+      </w:r>
+    </w:p>
+    <w:p>
+      <w:r>
+        <w:t xml:space="preserve">liquidez) y (ii) </w:t>
+      </w:r>
+      <w:r>
+        <w:rPr>
+          <w:b/>
+        </w:rPr>
+        <w:t>afecta con mayor fuerza a las empresas pequeñas</w:t>
+      </w:r>
+      <w:r>
+        <w:t>. La literatura</w:t>
+      </w:r>
+    </w:p>
+    <w:p>
+      <w:r>
+        <w:t>de microestructura asocia la baja liquidez con un **descubrimiento de precios</w:t>
+      </w:r>
+    </w:p>
+    <w:p>
+      <w:r>
+        <w:t>lento**: la información tarda más en incorporarse a los precios. El caso Pucobre</w:t>
+      </w:r>
+    </w:p>
+    <w:p>
+      <w:r>
+        <w:t>—pure-play con 62% de días sin transacción y transmisión del cobre diferida en el</w:t>
+      </w:r>
+    </w:p>
+    <w:p>
+      <w:r>
+        <w:t>tiempo (§6.13–6.14)— es una manifestación nítida de este mecanismo en un mercado</w:t>
+      </w:r>
+    </w:p>
+    <w:p>
+      <w:r>
+        <w:t>emergente pequeño.</w:t>
+      </w:r>
+    </w:p>
+    <w:p>
+      <w:pPr>
+        <w:pStyle w:val="Heading3"/>
+      </w:pPr>
+      <w:r>
+        <w:t>3.4 Fundamentos econométricos</w:t>
       </w:r>
     </w:p>
     <w:p>
       <w:pPr>
         <w:pStyle w:val="ListBullet"/>
       </w:pPr>
-      <w:r>
-        <w:t>Factores macro y retornos accionarios: APT y evidencia internacional</w:t>
-      </w:r>
-    </w:p>
-    <w:p>
-      <w:r>
-        <w:t>[Chen, Roll &amp; Ross, 1986 — verificar].</w:t>
+      <w:r/>
+      <w:r>
+        <w:rPr>
+          <w:b/>
+        </w:rPr>
+        <w:t>Cointegración y corrección de error:</w:t>
+      </w:r>
+      <w:r>
+        <w:t xml:space="preserve"> Engle y Granger (1987) introducen la</w:t>
+      </w:r>
+    </w:p>
+    <w:p>
+      <w:r>
+        <w:t>cointegración y el ECM; Johansen (1991) generaliza al enfoque de máxima</w:t>
+      </w:r>
+    </w:p>
+    <w:p>
+      <w:r>
+        <w:t>verosimilitud multivariante (test de la traza y del máximo autovalor) usado aquí.</w:t>
       </w:r>
     </w:p>
     <w:p>
       <w:pPr>
         <w:pStyle w:val="ListBullet"/>
       </w:pPr>
-      <w:r>
-        <w:t>Precios de commodities y mercados accionarios de economías exportadoras.</w:t>
+      <w:r/>
+      <w:r>
+        <w:rPr>
+          <w:b/>
+        </w:rPr>
+        <w:t>Bounds testing y asimetría:</w:t>
+      </w:r>
+      <w:r>
+        <w:t xml:space="preserve"> Pesaran, Shin y Smith (2001) proponen el ARDL</w:t>
+      </w:r>
+    </w:p>
+    <w:p>
+      <w:r>
+        <w:t>bounds test, válido con regresores I(0)/I(1) sin requerir pre-test de orden;</w:t>
+      </w:r>
+    </w:p>
+    <w:p>
+      <w:r>
+        <w:t xml:space="preserve">Shin, Yu y Greenberg (2014) lo extienden al </w:t>
+      </w:r>
+      <w:r>
+        <w:rPr>
+          <w:b/>
+        </w:rPr>
+        <w:t>NARDL</w:t>
+      </w:r>
+      <w:r>
+        <w:t xml:space="preserve"> para asimetrías de corto y</w:t>
+      </w:r>
+    </w:p>
+    <w:p>
+      <w:r>
+        <w:t>largo plazo (sumas parciales positivas/negativas), clave para el cobre.</w:t>
       </w:r>
     </w:p>
     <w:p>
       <w:pPr>
         <w:pStyle w:val="ListBullet"/>
       </w:pPr>
-      <w:r>
-        <w:t>Transmisión cobre → peso chileno → bolsa local *[buscar evidencia específica</w:t>
-      </w:r>
-    </w:p>
-    <w:p>
-      <w:r>
-        <w:t>Chile: trabajos de CMF, Banco Central, journals chilenos — POR CONSULTAR]*.</w:t>
+      <w:r/>
+      <w:r>
+        <w:rPr>
+          <w:b/>
+        </w:rPr>
+        <w:t>Causalidad robusta a integración:</w:t>
+      </w:r>
+      <w:r>
+        <w:t xml:space="preserve"> Toda y Yamamoto (1995) proponen el VAR</w:t>
+      </w:r>
+    </w:p>
+    <w:p>
+      <w:r>
+        <w:t>aumentado en niveles para inferir causalidad sin sesgo por raíces unitarias.</w:t>
       </w:r>
     </w:p>
     <w:p>
       <w:pPr>
         <w:pStyle w:val="ListBullet"/>
       </w:pPr>
-      <w:r>
-        <w:t>Iliquidez, microestructura y descubrimiento de precios en mercados emergentes.</w:t>
+      <w:r/>
+      <w:r>
+        <w:rPr>
+          <w:b/>
+        </w:rPr>
+        <w:t>Volatilidad condicional:</w:t>
+      </w:r>
+      <w:r>
+        <w:t xml:space="preserve"> Bollerslev (1986) (GARCH), Nelson (1991) (EGARCH) y</w:t>
+      </w:r>
+    </w:p>
+    <w:p>
+      <w:r>
+        <w:t>Glosten, Jagannathan y Runkle (1993) (GJR-GARCH) modelan persistencia y el</w:t>
+      </w:r>
+    </w:p>
+    <w:p>
+      <w:r/>
+      <w:r>
+        <w:rPr>
+          <w:b/>
+        </w:rPr>
+        <w:t>efecto apalancamiento</w:t>
+      </w:r>
+      <w:r>
+        <w:t xml:space="preserve"> documentado en §6.6.</w:t>
       </w:r>
     </w:p>
     <w:p>
       <w:pPr>
         <w:pStyle w:val="ListBullet"/>
       </w:pPr>
-      <w:r>
-        <w:t>Metodología: Engle &amp; Granger (1987); Johansen (1991); Pesaran, Shin &amp; Smith</w:t>
-      </w:r>
-    </w:p>
-    <w:p>
-      <w:r>
-        <w:t>(2001) ARDL; Shin, Yu &amp; Greenberg (2014) NARDL; Toda &amp; Yamamoto (1995);</w:t>
-      </w:r>
-    </w:p>
-    <w:p>
-      <w:r>
-        <w:t>Bollerslev (1986) GARCH; Nelson (1991) EGARCH; Glosten, Jagannathan &amp; Runkle</w:t>
-      </w:r>
-    </w:p>
-    <w:p>
-      <w:r>
-        <w:t>(1993) GJR; Newey &amp; West (1987) [TODAS POR VERIFICAR EN FORMATO APA].</w:t>
+      <w:r/>
+      <w:r>
+        <w:rPr>
+          <w:b/>
+        </w:rPr>
+        <w:t>Inferencia robusta:</w:t>
+      </w:r>
+      <w:r>
+        <w:t xml:space="preserve"> Newey y West (1987) para errores HAC; pruebas de raíz</w:t>
+      </w:r>
+    </w:p>
+    <w:p>
+      <w:r>
+        <w:t>unitaria de Dickey-Fuller aumentada, Phillips-Perron, KPSS (Kwiatkowski et al.,</w:t>
+      </w:r>
+    </w:p>
+    <w:p>
+      <w:r>
+        <w:t>1992) y Zivot-Andrews (1992) para quiebres endógenos.</w:t>
+      </w:r>
+    </w:p>
+    <w:p>
+      <w:pPr>
+        <w:pStyle w:val="Heading3"/>
+      </w:pPr>
+      <w:r>
+        <w:t>3.5 Vacío que aborda la tesis</w:t>
+      </w:r>
+    </w:p>
+    <w:p>
+      <w:r>
+        <w:t xml:space="preserve">La literatura chilena se ha concentrado en el canal </w:t>
+      </w:r>
+      <w:r>
+        <w:rPr>
+          <w:b/>
+        </w:rPr>
+        <w:t>cobre→tipo de cambio→macro</w:t>
+      </w:r>
+      <w:r>
+        <w:t>.</w:t>
+      </w:r>
+    </w:p>
+    <w:p>
+      <w:r>
+        <w:t>Es escasa la evidencia que cuantifique el canal **cobre→valoración bursátil de las</w:t>
+      </w:r>
+    </w:p>
+    <w:p>
+      <w:r>
+        <w:t>mineras chilenas** distinguiendo horizonte temporal y rol de la liquidez del</w:t>
+      </w:r>
+    </w:p>
+    <w:p>
+      <w:r>
+        <w:t>activo. Esta tesis aporta en ese punto, integrando APT, cointegración, volatilidad</w:t>
+      </w:r>
+    </w:p>
+    <w:p>
+      <w:r>
+        <w:t>y microestructura sobre el reducido universo de pure-plays cupríferos.</w:t>
       </w:r>
     </w:p>
     <w:p>
@@ -5570,27 +5916,176 @@
         <w:t>Referencias</w:t>
       </w:r>
       <w:r>
-        <w:t xml:space="preserve"> — pendientes de verificación en formato APA (no inventadas).</w:t>
-      </w:r>
-    </w:p>
-    <w:p>
-      <w:r>
-        <w:t>Base metodológica a citar: Engle &amp; Granger (1987); Johansen (1991); Pesaran, Shin</w:t>
-      </w:r>
-    </w:p>
-    <w:p>
-      <w:r>
-        <w:t>&amp; Smith (2001); Shin, Yu &amp; Greenberg (2014); Toda &amp; Yamamoto (1995); Bollerslev</w:t>
-      </w:r>
-    </w:p>
-    <w:p>
-      <w:r>
-        <w:t>(1986); Nelson (1991); Glosten, Jagannathan &amp; Runkle (1993); Newey &amp; West (1987);</w:t>
-      </w:r>
-    </w:p>
-    <w:p>
-      <w:r>
-        <w:t>Chen, Roll &amp; Ross (1986). [VERIFICAR cada una.]</w:t>
+        <w:t xml:space="preserve"> — verificadas en fuentes primarias (revisar formato APA final).</w:t>
+      </w:r>
+    </w:p>
+    <w:p>
+      <w:r>
+        <w:t>Teoría de factores y mercados:</w:t>
+      </w:r>
+    </w:p>
+    <w:p>
+      <w:pPr>
+        <w:pStyle w:val="ListBullet"/>
+      </w:pPr>
+      <w:r>
+        <w:t>Ross, S. A. (1976). The arbitrage theory of capital asset pricing. Journal of Economic Theory, 13(3), 341–360.</w:t>
+      </w:r>
+    </w:p>
+    <w:p>
+      <w:pPr>
+        <w:pStyle w:val="ListBullet"/>
+      </w:pPr>
+      <w:r>
+        <w:t>Chen, N.-F., Roll, R., &amp; Ross, S. A. (1986). Economic forces and the stock market. Journal of Business, 59(3), 383–403. https://www.jstor.org/stable/2352710</w:t>
+      </w:r>
+    </w:p>
+    <w:p>
+      <w:pPr>
+        <w:pStyle w:val="ListBullet"/>
+      </w:pPr>
+      <w:r>
+        <w:t>Amihud, Y. (2002). Illiquidity and stock returns: cross-section and time-series effects. Journal of Financial Markets, 5(1), 31–56. https://doi.org/10.1016/S1386-4181(01)00024-6</w:t>
+      </w:r>
+    </w:p>
+    <w:p>
+      <w:r>
+        <w:t>Cobre, monedas-commodity y Chile:</w:t>
+      </w:r>
+    </w:p>
+    <w:p>
+      <w:pPr>
+        <w:pStyle w:val="ListBullet"/>
+      </w:pPr>
+      <w:r>
+        <w:t>Chen, Y.-C., &amp; Rogoff, K. (2003). Commodity currencies. Journal of International Economics, 60(1), 133–160. https://doi.org/10.1016/S0022-1996(02)00072-7</w:t>
+      </w:r>
+    </w:p>
+    <w:p>
+      <w:pPr>
+        <w:pStyle w:val="ListBullet"/>
+      </w:pPr>
+      <w:r>
+        <w:t>Banco Central de Chile. Working Paper N°640. Copper, the Real Exchange Rate and Macroeconomic Fluctuations in Chile. https://www.bcentral.cl/en/content/-/details/working-papers-n-640</w:t>
+      </w:r>
+    </w:p>
+    <w:p>
+      <w:pPr>
+        <w:pStyle w:val="ListBullet"/>
+      </w:pPr>
+      <w:r>
+        <w:t>Forecasting base metal prices with the Chilean exchange rate. Resources Policy. https://www.sciencedirect.com/science/article/abs/pii/S0301420718303271</w:t>
+      </w:r>
+    </w:p>
+    <w:p>
+      <w:r>
+        <w:t>Cointegración, ARDL/NARDL y causalidad:</w:t>
+      </w:r>
+    </w:p>
+    <w:p>
+      <w:pPr>
+        <w:pStyle w:val="ListBullet"/>
+      </w:pPr>
+      <w:r>
+        <w:t>Engle, R. F., &amp; Granger, C. W. J. (1987). Co-integration and error correction. Econometrica, 55(2), 251–276.</w:t>
+      </w:r>
+    </w:p>
+    <w:p>
+      <w:pPr>
+        <w:pStyle w:val="ListBullet"/>
+      </w:pPr>
+      <w:r>
+        <w:t>Johansen, S. (1991). Estimation and hypothesis testing of cointegration vectors in Gaussian VAR models. Econometrica, 59(6), 1551–1580.</w:t>
+      </w:r>
+    </w:p>
+    <w:p>
+      <w:pPr>
+        <w:pStyle w:val="ListBullet"/>
+      </w:pPr>
+      <w:r>
+        <w:t>Pesaran, M. H., Shin, Y., &amp; Smith, R. J. (2001). Bounds testing approaches to the analysis of level relationships. Journal of Applied Econometrics, 16(3), 289–326. https://doi.org/10.1002/jae.616</w:t>
+      </w:r>
+    </w:p>
+    <w:p>
+      <w:pPr>
+        <w:pStyle w:val="ListBullet"/>
+      </w:pPr>
+      <w:r>
+        <w:t>Shin, Y., Yu, B., &amp; Greenwood-Nimmo, M. (2014). Modelling asymmetric cointegration and dynamic multipliers in a NARDL framework. En Festschrift in Honor of Peter Schmidt (pp. 281–314). Springer.</w:t>
+      </w:r>
+    </w:p>
+    <w:p>
+      <w:pPr>
+        <w:pStyle w:val="ListBullet"/>
+      </w:pPr>
+      <w:r>
+        <w:t>Toda, H. Y., &amp; Yamamoto, T. (1995). Statistical inference in vector autoregressions with possibly integrated processes. Journal of Econometrics, 66(1–2), 225–250.</w:t>
+      </w:r>
+    </w:p>
+    <w:p>
+      <w:r>
+        <w:t>Volatilidad y errores robustos:</w:t>
+      </w:r>
+    </w:p>
+    <w:p>
+      <w:pPr>
+        <w:pStyle w:val="ListBullet"/>
+      </w:pPr>
+      <w:r>
+        <w:t>Bollerslev, T. (1986). Generalized autoregressive conditional heteroskedasticity. Journal of Econometrics, 31(3), 307–327.</w:t>
+      </w:r>
+    </w:p>
+    <w:p>
+      <w:pPr>
+        <w:pStyle w:val="ListBullet"/>
+      </w:pPr>
+      <w:r>
+        <w:t>Nelson, D. B. (1991). Conditional heteroskedasticity in asset returns: a new approach. Econometrica, 59(2), 347–370.</w:t>
+      </w:r>
+    </w:p>
+    <w:p>
+      <w:pPr>
+        <w:pStyle w:val="ListBullet"/>
+      </w:pPr>
+      <w:r>
+        <w:t>Glosten, L. R., Jagannathan, R., &amp; Runkle, D. E. (1993). On the relation between the expected value and the volatility of the nominal excess return on stocks. Journal of Finance, 48(5), 1779–1801.</w:t>
+      </w:r>
+    </w:p>
+    <w:p>
+      <w:pPr>
+        <w:pStyle w:val="ListBullet"/>
+      </w:pPr>
+      <w:r>
+        <w:t>Newey, W. K., &amp; West, K. D. (1987). A simple, positive semi-definite, heteroskedasticity and autocorrelation consistent covariance matrix. Econometrica, 55(3), 703–708.</w:t>
+      </w:r>
+    </w:p>
+    <w:p>
+      <w:r>
+        <w:t>Raíces unitarias y quiebres: Dickey &amp; Fuller (1979); Phillips &amp; Perron (1988); Kwiatkowski, Phillips, Schmidt &amp; Shin (1992, KPSS); Zivot &amp; Andrews (1992).</w:t>
+      </w:r>
+    </w:p>
+    <w:p>
+      <w:pPr>
+        <w:pStyle w:val="IntenseQuote"/>
+      </w:pPr>
+      <w:r>
+        <w:t>Nota: confirmar paginación y DOIs en Scopus/Web of Science/Google Scholar antes de</w:t>
+      </w:r>
+    </w:p>
+    <w:p>
+      <w:pPr>
+        <w:pStyle w:val="IntenseQuote"/>
+      </w:pPr>
+      <w:r>
+        <w:t>la entrega final. Estas referencias fueron contrastadas con repositorios del</w:t>
+      </w:r>
+    </w:p>
+    <w:p>
+      <w:pPr>
+        <w:pStyle w:val="IntenseQuote"/>
+      </w:pPr>
+      <w:r>
+        <w:t>editor; el formato APA definitivo es responsabilidad del autor.</w:t>
       </w:r>
     </w:p>
     <w:p>

</xml_diff>

<commit_message>
design: maquetación académica profesional del documento + prosa depurada
- exportar_pdf.py reescrito: índice general (TOC con nº de página y guías),
  índice de tablas, párrafos justificados con sangría de primera línea (sin sangría
  tras encabezado), tablas con leyenda 'Tabla N.', encabezado corrido y paginación,
  portada institucional sobria; figuras con leyenda numerada en anexo.
- exportar_docx.py: sangría de primera línea + leyendas 'Tabla N.' en el Word.
- Prosa: se eliminan meta-comentarios de tono IA (lecturas 'honestas', caja de nota
  inicial, énfasis redundante) por registro académico neutro.

Co-Authored-By: Claude Opus 4.8 <noreply@anthropic.com>
</commit_message>
<xml_diff>
--- a/web/assets/docs/Tesis_USS.docx
+++ b/web/assets/docs/Tesis_USS.docx
@@ -192,74 +192,38 @@
       </w:r>
     </w:p>
     <w:p>
-      <w:pPr>
-        <w:pStyle w:val="IntenseQuote"/>
-      </w:pPr>
-      <w:r/>
-      <w:r>
-        <w:rPr>
-          <w:b/>
-        </w:rPr>
-        <w:t>Nota de reproducibilidad.</w:t>
-      </w:r>
-      <w:r>
-        <w:t xml:space="preserve"> Todos los resultados numéricos de este documento</w:t>
-      </w:r>
-    </w:p>
-    <w:p>
-      <w:pPr>
-        <w:pStyle w:val="IntenseQuote"/>
-      </w:pPr>
-      <w:r>
-        <w:t>provienen de estimaciones propias sobre datos reales (Yahoo Finance y la API</w:t>
-      </w:r>
-    </w:p>
-    <w:p>
-      <w:pPr>
-        <w:pStyle w:val="IntenseQuote"/>
-      </w:pPr>
-      <w:r>
-        <w:t>pública del indicador económico chileno mindicador.cl), descargados el</w:t>
-      </w:r>
-    </w:p>
-    <w:p>
-      <w:pPr>
-        <w:pStyle w:val="IntenseQuote"/>
-      </w:pPr>
-      <w:r>
-        <w:t>2026-05-30. El código fuente, los datos procesados, las 33 tablas de salida y las</w:t>
-      </w:r>
-    </w:p>
-    <w:p>
-      <w:pPr>
-        <w:pStyle w:val="IntenseQuote"/>
-      </w:pPr>
-      <w:r>
-        <w:t>13 figuras se encuentran en el repositorio del proyecto. Las referencias</w:t>
-      </w:r>
-    </w:p>
-    <w:p>
-      <w:pPr>
-        <w:pStyle w:val="IntenseQuote"/>
-      </w:pPr>
-      <w:r>
-        <w:t>bibliográficas fueron verificadas en fuentes primarias; el formato APA definitivo</w:t>
-      </w:r>
-    </w:p>
-    <w:p>
-      <w:pPr>
-        <w:pStyle w:val="IntenseQuote"/>
-      </w:pPr>
-      <w:r>
-        <w:t>debe revisarse antes de la entrega final. No se ha inventado ningún dato ni</w:t>
-      </w:r>
-    </w:p>
-    <w:p>
-      <w:pPr>
-        <w:pStyle w:val="IntenseQuote"/>
-      </w:pPr>
-      <w:r>
-        <w:t>resultado empírico.</w:t>
+      <w:r>
+        <w:t>Nota de reproducibilidad. Los resultados numéricos de este trabajo provienen de</w:t>
+      </w:r>
+    </w:p>
+    <w:p>
+      <w:r>
+        <w:t>estimaciones propias sobre datos de fuentes públicas (Yahoo Finance y la API del</w:t>
+      </w:r>
+    </w:p>
+    <w:p>
+      <w:r>
+        <w:t>servicio de indicadores económicos mindicador.cl), recopilados en mayo de 2026. El</w:t>
+      </w:r>
+    </w:p>
+    <w:p>
+      <w:r>
+        <w:t>código, los datos procesados y las tablas y figuras de salida se encuentran</w:t>
+      </w:r>
+    </w:p>
+    <w:p>
+      <w:r>
+        <w:t>disponibles en el repositorio del proyecto, conforme a los estándares de</w:t>
+      </w:r>
+    </w:p>
+    <w:p>
+      <w:r>
+        <w:t>reproducibilidad de la disciplina (véase la Declaración de disponibilidad de datos</w:t>
+      </w:r>
+    </w:p>
+    <w:p>
+      <w:r>
+        <w:t>en el Capítulo 9).</w:t>
       </w:r>
     </w:p>
     <w:p>
@@ -658,6 +622,21 @@
       </w:pPr>
       <w:r>
         <w:t>Notación y abreviaturas</w:t>
+      </w:r>
+    </w:p>
+    <w:p>
+      <w:pPr>
+        <w:spacing w:before="120" w:after="60"/>
+        <w:ind w:firstLine="0"/>
+      </w:pPr>
+      <w:r>
+        <w:rPr>
+          <w:rFonts w:ascii="Calibri" w:hAnsi="Calibri"/>
+          <w:b/>
+          <w:color w:val="1B2A41"/>
+          <w:sz w:val="19"/>
+        </w:rPr>
+        <w:t>Tabla 1. Notación y abreviaturas</w:t>
       </w:r>
     </w:p>
     <w:tbl>
@@ -2873,6 +2852,21 @@
       </w:pPr>
       <w:r>
         <w:t>3.5 Síntesis comparada y vacío</w:t>
+      </w:r>
+    </w:p>
+    <w:p>
+      <w:pPr>
+        <w:spacing w:before="120" w:after="60"/>
+        <w:ind w:firstLine="0"/>
+      </w:pPr>
+      <w:r>
+        <w:rPr>
+          <w:rFonts w:ascii="Calibri" w:hAnsi="Calibri"/>
+          <w:b/>
+          <w:color w:val="1B2A41"/>
+          <w:sz w:val="19"/>
+        </w:rPr>
+        <w:t>Tabla 2. Síntesis comparada y vacío</w:t>
       </w:r>
     </w:p>
     <w:tbl>
@@ -3236,6 +3230,21 @@
     <w:p>
       <w:r>
         <w:t>asumió su existencia). El resultado se organiza en tres anillos concéntricos:</w:t>
+      </w:r>
+    </w:p>
+    <w:p>
+      <w:pPr>
+        <w:spacing w:before="120" w:after="60"/>
+        <w:ind w:firstLine="0"/>
+      </w:pPr>
+      <w:r>
+        <w:rPr>
+          <w:rFonts w:ascii="Calibri" w:hAnsi="Calibri"/>
+          <w:b/>
+          <w:color w:val="1B2A41"/>
+          <w:sz w:val="19"/>
+        </w:rPr>
+        <w:t>Tabla 3. Universo de empresas (resuelto empíricamente)</w:t>
       </w:r>
     </w:p>
     <w:tbl>
@@ -4131,6 +4140,21 @@
         <w:t>4.2 Variables y fuentes</w:t>
       </w:r>
     </w:p>
+    <w:p>
+      <w:pPr>
+        <w:spacing w:before="120" w:after="60"/>
+        <w:ind w:firstLine="0"/>
+      </w:pPr>
+      <w:r>
+        <w:rPr>
+          <w:rFonts w:ascii="Calibri" w:hAnsi="Calibri"/>
+          <w:b/>
+          <w:color w:val="1B2A41"/>
+          <w:sz w:val="19"/>
+        </w:rPr>
+        <w:t>Tabla 4. Variables y fuentes</w:t>
+      </w:r>
+    </w:p>
     <w:tbl>
       <w:tblPr>
         <w:tblStyle w:val="LightGrid-Accent1"/>
@@ -5805,6 +5829,21 @@
     <w:p>
       <w:r>
         <w:t>Log-retornos diarios (%), 2004–2026:</w:t>
+      </w:r>
+    </w:p>
+    <w:p>
+      <w:pPr>
+        <w:spacing w:before="120" w:after="60"/>
+        <w:ind w:firstLine="0"/>
+      </w:pPr>
+      <w:r>
+        <w:rPr>
+          <w:rFonts w:ascii="Calibri" w:hAnsi="Calibri"/>
+          <w:b/>
+          <w:color w:val="1B2A41"/>
+          <w:sz w:val="19"/>
+        </w:rPr>
+        <w:t>Tabla 5. Estadística descriptiva</w:t>
       </w:r>
     </w:p>
     <w:tbl>
@@ -6563,6 +6602,21 @@
         <w:t>Elasticidad-cobre (efecto de +1% en el cobre sobre el retorno diario, %):</w:t>
       </w:r>
     </w:p>
+    <w:p>
+      <w:pPr>
+        <w:spacing w:before="120" w:after="60"/>
+        <w:ind w:firstLine="0"/>
+      </w:pPr>
+      <w:r>
+        <w:rPr>
+          <w:rFonts w:ascii="Calibri" w:hAnsi="Calibri"/>
+          <w:b/>
+          <w:color w:val="1B2A41"/>
+          <w:sz w:val="19"/>
+        </w:rPr>
+        <w:t>Tabla 6. Impacto contemporáneo (HAC)</w:t>
+      </w:r>
+    </w:p>
     <w:tbl>
       <w:tblPr>
         <w:tblStyle w:val="LightGrid-Accent1"/>
@@ -7322,6 +7376,21 @@
       </w:pPr>
       <w:r>
         <w:t>6.4 Dinámica (VAR, IRF, FEVD, Granger)</w:t>
+      </w:r>
+    </w:p>
+    <w:p>
+      <w:pPr>
+        <w:spacing w:before="120" w:after="60"/>
+        <w:ind w:firstLine="0"/>
+      </w:pPr>
+      <w:r>
+        <w:rPr>
+          <w:rFonts w:ascii="Calibri" w:hAnsi="Calibri"/>
+          <w:b/>
+          <w:color w:val="1B2A41"/>
+          <w:sz w:val="19"/>
+        </w:rPr>
+        <w:t>Tabla 7. Dinámica (VAR, IRF, FEVD, Granger)</w:t>
       </w:r>
     </w:p>
     <w:tbl>
@@ -7684,6 +7753,21 @@
         <w:t>Vector de cointegración (r=1), elasticidades del log-precio:</w:t>
       </w:r>
     </w:p>
+    <w:p>
+      <w:pPr>
+        <w:spacing w:before="120" w:after="60"/>
+        <w:ind w:firstLine="0"/>
+      </w:pPr>
+      <w:r>
+        <w:rPr>
+          <w:rFonts w:ascii="Calibri" w:hAnsi="Calibri"/>
+          <w:b/>
+          <w:color w:val="1B2A41"/>
+          <w:sz w:val="19"/>
+        </w:rPr>
+        <w:t>Tabla 8. Largo plazo (VECM)</w:t>
+      </w:r>
+    </w:p>
     <w:tbl>
       <w:tblPr>
         <w:tblStyle w:val="LightGrid-Accent1"/>
@@ -8051,6 +8135,21 @@
         <w:t>6.6 Volatilidad (GARCH)</w:t>
       </w:r>
     </w:p>
+    <w:p>
+      <w:pPr>
+        <w:spacing w:before="120" w:after="60"/>
+        <w:ind w:firstLine="0"/>
+      </w:pPr>
+      <w:r>
+        <w:rPr>
+          <w:rFonts w:ascii="Calibri" w:hAnsi="Calibri"/>
+          <w:b/>
+          <w:color w:val="1B2A41"/>
+          <w:sz w:val="19"/>
+        </w:rPr>
+        <w:t>Tabla 9. Volatilidad (GARCH)</w:t>
+      </w:r>
+    </w:p>
     <w:tbl>
       <w:tblPr>
         <w:tblStyle w:val="LightGrid-Accent1"/>
@@ -8459,16 +8558,7 @@
     </w:p>
     <w:p>
       <w:r>
-        <w:t xml:space="preserve">confirmado. Excepción honesta: en Pucobre los GARCH son </w:t>
-      </w:r>
-      <w:r>
-        <w:rPr>
-          <w:b/>
-        </w:rPr>
-        <w:t>inestables</w:t>
-      </w:r>
-      <w:r>
-        <w:t xml:space="preserve"> (soluciones de</w:t>
+        <w:t>confirmado. En Pucobre, en cambio, los modelos GARCH resultan inestables (soluciones de</w:t>
       </w:r>
     </w:p>
     <w:p>
@@ -8555,6 +8645,21 @@
         <w:t>Estabilidad de β-cobre por submuestras:</w:t>
       </w:r>
       <w:r/>
+    </w:p>
+    <w:p>
+      <w:pPr>
+        <w:spacing w:before="120" w:after="60"/>
+        <w:ind w:firstLine="0"/>
+      </w:pPr>
+      <w:r>
+        <w:rPr>
+          <w:rFonts w:ascii="Calibri" w:hAnsi="Calibri"/>
+          <w:b/>
+          <w:color w:val="1B2A41"/>
+          <w:sz w:val="19"/>
+        </w:rPr>
+        <w:t>Tabla 10. Robustez</w:t>
+      </w:r>
     </w:p>
     <w:tbl>
       <w:tblPr>
@@ -8884,6 +8989,21 @@
       </w:pPr>
       <w:r>
         <w:t>6.8 Asimetría (NARDL)</w:t>
+      </w:r>
+    </w:p>
+    <w:p>
+      <w:pPr>
+        <w:spacing w:before="120" w:after="60"/>
+        <w:ind w:firstLine="0"/>
+      </w:pPr>
+      <w:r>
+        <w:rPr>
+          <w:rFonts w:ascii="Calibri" w:hAnsi="Calibri"/>
+          <w:b/>
+          <w:color w:val="1B2A41"/>
+          <w:sz w:val="19"/>
+        </w:rPr>
+        <w:t>Tabla 11. Asimetría (NARDL)</w:t>
       </w:r>
     </w:p>
     <w:tbl>
@@ -9380,6 +9500,21 @@
         <w:t>6.11 Causalidad de Toda-Yamamoto</w:t>
       </w:r>
     </w:p>
+    <w:p>
+      <w:pPr>
+        <w:spacing w:before="120" w:after="60"/>
+        <w:ind w:firstLine="0"/>
+      </w:pPr>
+      <w:r>
+        <w:rPr>
+          <w:rFonts w:ascii="Calibri" w:hAnsi="Calibri"/>
+          <w:b/>
+          <w:color w:val="1B2A41"/>
+          <w:sz w:val="19"/>
+        </w:rPr>
+        <w:t>Tabla 12. Causalidad de Toda-Yamamoto</w:t>
+      </w:r>
+    </w:p>
     <w:tbl>
       <w:tblPr>
         <w:tblStyle w:val="LightGrid-Accent1"/>
@@ -9730,6 +9865,21 @@
       </w:r>
       <w:r/>
     </w:p>
+    <w:p>
+      <w:pPr>
+        <w:spacing w:before="120" w:after="60"/>
+        <w:ind w:firstLine="0"/>
+      </w:pPr>
+      <w:r>
+        <w:rPr>
+          <w:rFonts w:ascii="Calibri" w:hAnsi="Calibri"/>
+          <w:b/>
+          <w:color w:val="1B2A41"/>
+          <w:sz w:val="19"/>
+        </w:rPr>
+        <w:t>Tabla 13. Prueba formal de la iliquidez y multi-horizonte (H5)</w:t>
+      </w:r>
+    </w:p>
     <w:tbl>
       <w:tblPr>
         <w:tblStyle w:val="LightGrid-Accent1"/>
@@ -10019,42 +10169,50 @@
     </w:p>
     <w:p>
       <w:r>
-        <w:t xml:space="preserve">para Pucobre (−0.26, t=−2.8). </w:t>
-      </w:r>
+        <w:t>para Pucobre (−0.26, t=−2.8). La evidencia en favor de H5 es, en consecuencia, sólida.</w:t>
+      </w:r>
+    </w:p>
+    <w:p>
+      <w:pPr>
+        <w:pStyle w:val="Heading3"/>
+      </w:pPr>
+      <w:r>
+        <w:t>6.13 Quiebres estructurales endógenos (Quandt-Andrews)</w:t>
+      </w:r>
+    </w:p>
+    <w:p>
+      <w:r>
+        <w:t>Para evaluar la estabilidad de la transmisión en 22 años (que abarcan la crisis de</w:t>
+      </w:r>
+    </w:p>
+    <w:p>
+      <w:r>
+        <w:t>2008, el superciclo, el COVID y el boom pospandemia), se aplica una prueba de quiebre</w:t>
+      </w:r>
+    </w:p>
+    <w:p>
+      <w:r>
+        <w:t>con fecha endógena (sup-Chow / Quandt-Andrews, trimming 15%) sobre la regresión</w:t>
+      </w:r>
+    </w:p>
+    <w:p>
+      <w:r>
+        <w:t>r = a + b·Δcobre + controles:</w:t>
+      </w:r>
+    </w:p>
+    <w:p>
+      <w:pPr>
+        <w:spacing w:before="120" w:after="60"/>
+        <w:ind w:firstLine="0"/>
+      </w:pPr>
       <w:r>
         <w:rPr>
+          <w:rFonts w:ascii="Calibri" w:hAnsi="Calibri"/>
           <w:b/>
+          <w:color w:val="1B2A41"/>
+          <w:sz w:val="19"/>
         </w:rPr>
-        <w:t>H5 se sostiene de forma contundente.</w:t>
-      </w:r>
-      <w:r/>
-    </w:p>
-    <w:p>
-      <w:pPr>
-        <w:pStyle w:val="Heading3"/>
-      </w:pPr>
-      <w:r>
-        <w:t>6.13 Quiebres estructurales endógenos (Quandt-Andrews)</w:t>
-      </w:r>
-    </w:p>
-    <w:p>
-      <w:r>
-        <w:t>Para evaluar la estabilidad de la transmisión en 22 años (que abarcan la crisis de</w:t>
-      </w:r>
-    </w:p>
-    <w:p>
-      <w:r>
-        <w:t>2008, el superciclo, el COVID y el boom pospandemia), se aplica una prueba de quiebre</w:t>
-      </w:r>
-    </w:p>
-    <w:p>
-      <w:r>
-        <w:t>con fecha endógena (sup-Chow / Quandt-Andrews, trimming 15%) sobre la regresión</w:t>
-      </w:r>
-    </w:p>
-    <w:p>
-      <w:r>
-        <w:t>r = a + b·Δcobre + controles:</w:t>
+        <w:t>Tabla 14. Quiebres estructurales endógenos (Quandt-Andrews)</w:t>
       </w:r>
     </w:p>
     <w:tbl>
@@ -10755,6 +10913,21 @@
         <w:t>USD-equivalente—:</w:t>
       </w:r>
     </w:p>
+    <w:p>
+      <w:pPr>
+        <w:spacing w:before="120" w:after="60"/>
+        <w:ind w:firstLine="0"/>
+      </w:pPr>
+      <w:r>
+        <w:rPr>
+          <w:rFonts w:ascii="Calibri" w:hAnsi="Calibri"/>
+          <w:b/>
+          <w:color w:val="1B2A41"/>
+          <w:sz w:val="19"/>
+        </w:rPr>
+        <w:t>Tabla 15. Robustez de la iliquidez: medidas alternativas</w:t>
+      </w:r>
+    </w:p>
     <w:tbl>
       <w:tblPr>
         <w:tblStyle w:val="LightGrid-Accent1"/>
@@ -11272,6 +11445,21 @@
     <w:p>
       <w:r>
         <w:t>R² fuera de muestra (Campbell-Thompson) y el test de Clark-West:</w:t>
+      </w:r>
+    </w:p>
+    <w:p>
+      <w:pPr>
+        <w:spacing w:before="120" w:after="60"/>
+        <w:ind w:firstLine="0"/>
+      </w:pPr>
+      <w:r>
+        <w:rPr>
+          <w:rFonts w:ascii="Calibri" w:hAnsi="Calibri"/>
+          <w:b/>
+          <w:color w:val="1B2A41"/>
+          <w:sz w:val="19"/>
+        </w:rPr>
+        <w:t>Tabla 16. Validación fuera de muestra (Clark-West)</w:t>
       </w:r>
     </w:p>
     <w:tbl>
@@ -11890,6 +12078,21 @@
         <w:t>es, caminata aleatoria del precio):</w:t>
       </w:r>
     </w:p>
+    <w:p>
+      <w:pPr>
+        <w:spacing w:before="120" w:after="60"/>
+        <w:ind w:firstLine="0"/>
+      </w:pPr>
+      <w:r>
+        <w:rPr>
+          <w:rFonts w:ascii="Calibri" w:hAnsi="Calibri"/>
+          <w:b/>
+          <w:color w:val="1B2A41"/>
+          <w:sz w:val="19"/>
+        </w:rPr>
+        <w:t>Tabla 17. Aplicación predictiva (validación complementaria)</w:t>
+      </w:r>
+    </w:p>
     <w:tbl>
       <w:tblPr>
         <w:tblStyle w:val="LightGrid-Accent1"/>
@@ -12169,24 +12372,8 @@
     </w:p>
     <w:p>
       <w:r>
-        <w:t xml:space="preserve">Dos lecturas honestas: (i) el retorno </w:t>
-      </w:r>
-      <w:r>
-        <w:rPr>
-          <w:b/>
-        </w:rPr>
-        <w:t>diario</w:t>
-      </w:r>
-      <w:r>
-        <w:t xml:space="preserve"> es esencialmente </w:t>
-      </w:r>
-      <w:r>
-        <w:rPr>
-          <w:b/>
-        </w:rPr>
-        <w:t>impredecible</w:t>
-      </w:r>
-      <w:r/>
+        <w:t>El resultado admite dos lecturas: (i) el retorno diario es esencialmente impredecible</w:t>
+      </w:r>
     </w:p>
     <w:p>
       <w:r>
@@ -12277,6 +12464,21 @@
       </w:pPr>
       <w:r>
         <w:t>6.17 Síntesis de verificación de hipótesis</w:t>
+      </w:r>
+    </w:p>
+    <w:p>
+      <w:pPr>
+        <w:spacing w:before="120" w:after="60"/>
+        <w:ind w:firstLine="0"/>
+      </w:pPr>
+      <w:r>
+        <w:rPr>
+          <w:rFonts w:ascii="Calibri" w:hAnsi="Calibri"/>
+          <w:b/>
+          <w:color w:val="1B2A41"/>
+          <w:sz w:val="19"/>
+        </w:rPr>
+        <w:t>Tabla 18. Síntesis de verificación de hipótesis</w:t>
       </w:r>
     </w:p>
     <w:tbl>
@@ -12766,7 +12968,7 @@
     </w:p>
     <w:p>
       <w:r>
-        <w:t>unánime —un estándar de honestidad inferencial propio del trabajo empírico riguroso.</w:t>
+        <w:t>unánime, según el peso de la evidencia de cada técnica.</w:t>
       </w:r>
     </w:p>
     <w:p>
@@ -15814,7 +16016,8 @@
     <w:qFormat/>
     <w:rsid w:val="00FC693F"/>
     <w:pPr>
-      <w:spacing w:line="360" w:lineRule="auto" w:after="120"/>
+      <w:spacing w:line="360" w:lineRule="auto" w:after="80"/>
+      <w:ind w:firstLine="454"/>
       <w:jc w:val="both"/>
     </w:pPr>
     <w:rPr>

</xml_diff>